<commit_message>
DOC-07 1.3 e DOC-11 regerados
</commit_message>
<xml_diff>
--- a/docs/DOC-07_Motor_de_Deteccao.docx
+++ b/docs/DOC-07_Motor_de_Deteccao.docx
@@ -267,7 +267,7 @@
                 <w:sz w:val="19"/>
                 <w:szCs w:val="19"/>
               </w:rPr>
-              <w:t xml:space="preserve">1.2</w:t>
+              <w:t xml:space="preserve">1.3</w:t>
             </w:r>
           </w:p>
         </w:tc>
@@ -326,7 +326,7 @@
                 <w:sz w:val="19"/>
                 <w:szCs w:val="19"/>
               </w:rPr>
-              <w:t xml:space="preserve">9 de outubro de 2026</w:t>
+              <w:t xml:space="preserve">13 de outubro de 2026</w:t>
             </w:r>
           </w:p>
         </w:tc>
@@ -3232,6 +3232,1500 @@
             </w:pPr>
             <w:r>
               <w:t xml:space="preserve">A-01 a A-04 comparam o preço com o que o próprio poder público pagou ou tabelou. Quando quase todos pagam caro pelo mesmo item, a mediana entre órgãos sobe junto e nada destoa. A-05 traz a régua do mercado, que a Lei 14.133 também aceita como parâmetro de pesquisa de preços (art. 23, § 1º, III e V). Começa pelo combustível, cuja referência é oficial, histórica e sem ambiguidade de produto.</w:t>
+            </w:r>
+          </w:p>
+        </w:tc>
+      </w:tr>
+    </w:tbl>
+    <w:p>
+      <w:pPr>
+        <w:pStyle w:val="Heading3"/>
+        <w:keepNext/>
+        <w:keepLines/>
+        <w:spacing w:after="100" w:before="220"/>
+      </w:pPr>
+      <w:r>
+        <w:t xml:space="preserve">A-05 com dados reais: o que as primeiras amostras mostram</w:t>
+      </w:r>
+    </w:p>
+    <w:p>
+      <w:pPr>
+        <w:spacing w:after="120"/>
+      </w:pPr>
+      <w:r>
+        <w:rPr>
+          <w:b w:val="false"/>
+          <w:bCs w:val="false"/>
+          <w:i w:val="false"/>
+          <w:iCs w:val="false"/>
+        </w:rPr>
+        <w:t xml:space="preserve">O fluxo mercado-referencia roda a regra em modo silencioso sobre compras reais do PNCP. Com a série semestral 2026-1 da ANP, o preço homologado com referência na UF se distribuiu assim (razão = preço pago ÷ mediana de revenda; * = menos de 20 itens):</w:t>
+      </w:r>
+    </w:p>
+    <w:tbl>
+      <w:tblPr>
+        <w:tblW w:type="dxa" w:w="9600"/>
+        <w:tblBorders>
+          <w:top w:val="single" w:color="BFBFBF" w:sz="4"/>
+          <w:left w:val="single" w:color="BFBFBF" w:sz="4"/>
+          <w:bottom w:val="single" w:color="BFBFBF" w:sz="4"/>
+          <w:right w:val="single" w:color="BFBFBF" w:sz="4"/>
+          <w:insideH w:val="single" w:color="D9D9D9" w:sz="2"/>
+          <w:insideV w:val="single" w:color="D9D9D9" w:sz="2"/>
+        </w:tblBorders>
+      </w:tblPr>
+      <w:tblGrid>
+        <w:gridCol w:w="1850"/>
+        <w:gridCol w:w="1450"/>
+        <w:gridCol w:w="950"/>
+        <w:gridCol w:w="750"/>
+        <w:gridCol w:w="750"/>
+        <w:gridCol w:w="650"/>
+        <w:gridCol w:w="950"/>
+        <w:gridCol w:w="750"/>
+        <w:gridCol w:w="750"/>
+        <w:gridCol w:w="750"/>
+      </w:tblGrid>
+      <w:tr>
+        <w:trPr>
+          <w:tblHeader/>
+        </w:trPr>
+        <w:tc>
+          <w:tcPr>
+            <w:tcW w:type="dxa" w:w="1850"/>
+            <w:shd w:fill="1F3864" w:val="clear"/>
+            <w:tcMar>
+              <w:top w:type="dxa" w:w="80"/>
+              <w:left w:type="dxa" w:w="110"/>
+              <w:bottom w:type="dxa" w:w="80"/>
+              <w:right w:type="dxa" w:w="110"/>
+            </w:tcMar>
+            <w:vAlign w:val="center"/>
+          </w:tcPr>
+          <w:p>
+            <w:pPr>
+              <w:spacing w:after="0"/>
+            </w:pPr>
+            <w:r>
+              <w:rPr>
+                <w:b/>
+                <w:bCs/>
+                <w:color w:val="FFFFFF"/>
+                <w:sz w:val="19"/>
+                <w:szCs w:val="19"/>
+              </w:rPr>
+              <w:t xml:space="preserve">Compras</w:t>
+            </w:r>
+          </w:p>
+        </w:tc>
+        <w:tc>
+          <w:tcPr>
+            <w:tcW w:type="dxa" w:w="1450"/>
+            <w:shd w:fill="1F3864" w:val="clear"/>
+            <w:tcMar>
+              <w:top w:type="dxa" w:w="80"/>
+              <w:left w:type="dxa" w:w="110"/>
+              <w:bottom w:type="dxa" w:w="80"/>
+              <w:right w:type="dxa" w:w="110"/>
+            </w:tcMar>
+            <w:vAlign w:val="center"/>
+          </w:tcPr>
+          <w:p>
+            <w:pPr>
+              <w:spacing w:after="0"/>
+            </w:pPr>
+            <w:r>
+              <w:rPr>
+                <w:b/>
+                <w:bCs/>
+                <w:color w:val="FFFFFF"/>
+                <w:sz w:val="19"/>
+                <w:szCs w:val="19"/>
+              </w:rPr>
+              <w:t xml:space="preserve">Combustível</w:t>
+            </w:r>
+          </w:p>
+        </w:tc>
+        <w:tc>
+          <w:tcPr>
+            <w:tcW w:type="dxa" w:w="950"/>
+            <w:shd w:fill="1F3864" w:val="clear"/>
+            <w:tcMar>
+              <w:top w:type="dxa" w:w="80"/>
+              <w:left w:type="dxa" w:w="110"/>
+              <w:bottom w:type="dxa" w:w="80"/>
+              <w:right w:type="dxa" w:w="110"/>
+            </w:tcMar>
+            <w:vAlign w:val="center"/>
+          </w:tcPr>
+          <w:p>
+            <w:pPr>
+              <w:spacing w:after="0"/>
+            </w:pPr>
+            <w:r>
+              <w:rPr>
+                <w:b/>
+                <w:bCs/>
+                <w:color w:val="FFFFFF"/>
+                <w:sz w:val="19"/>
+                <w:szCs w:val="19"/>
+              </w:rPr>
+              <w:t xml:space="preserve">Mediana</w:t>
+            </w:r>
+          </w:p>
+        </w:tc>
+        <w:tc>
+          <w:tcPr>
+            <w:tcW w:type="dxa" w:w="750"/>
+            <w:shd w:fill="1F3864" w:val="clear"/>
+            <w:tcMar>
+              <w:top w:type="dxa" w:w="80"/>
+              <w:left w:type="dxa" w:w="110"/>
+              <w:bottom w:type="dxa" w:w="80"/>
+              <w:right w:type="dxa" w:w="110"/>
+            </w:tcMar>
+            <w:vAlign w:val="center"/>
+          </w:tcPr>
+          <w:p>
+            <w:pPr>
+              <w:spacing w:after="0"/>
+            </w:pPr>
+            <w:r>
+              <w:rPr>
+                <w:b/>
+                <w:bCs/>
+                <w:color w:val="FFFFFF"/>
+                <w:sz w:val="19"/>
+                <w:szCs w:val="19"/>
+              </w:rPr>
+              <w:t xml:space="preserve">p90</w:t>
+            </w:r>
+          </w:p>
+        </w:tc>
+        <w:tc>
+          <w:tcPr>
+            <w:tcW w:type="dxa" w:w="750"/>
+            <w:shd w:fill="1F3864" w:val="clear"/>
+            <w:tcMar>
+              <w:top w:type="dxa" w:w="80"/>
+              <w:left w:type="dxa" w:w="110"/>
+              <w:bottom w:type="dxa" w:w="80"/>
+              <w:right w:type="dxa" w:w="110"/>
+            </w:tcMar>
+            <w:vAlign w:val="center"/>
+          </w:tcPr>
+          <w:p>
+            <w:pPr>
+              <w:spacing w:after="0"/>
+            </w:pPr>
+            <w:r>
+              <w:rPr>
+                <w:b/>
+                <w:bCs/>
+                <w:color w:val="FFFFFF"/>
+                <w:sz w:val="19"/>
+                <w:szCs w:val="19"/>
+              </w:rPr>
+              <w:t xml:space="preserve">≥ 1,2</w:t>
+            </w:r>
+          </w:p>
+        </w:tc>
+        <w:tc>
+          <w:tcPr>
+            <w:tcW w:type="dxa" w:w="650"/>
+            <w:shd w:fill="1F3864" w:val="clear"/>
+            <w:tcMar>
+              <w:top w:type="dxa" w:w="80"/>
+              <w:left w:type="dxa" w:w="110"/>
+              <w:bottom w:type="dxa" w:w="80"/>
+              <w:right w:type="dxa" w:w="110"/>
+            </w:tcMar>
+            <w:vAlign w:val="center"/>
+          </w:tcPr>
+          <w:p>
+            <w:pPr>
+              <w:spacing w:after="0"/>
+            </w:pPr>
+            <w:r>
+              <w:rPr>
+                <w:b/>
+                <w:bCs/>
+                <w:color w:val="FFFFFF"/>
+                <w:sz w:val="19"/>
+                <w:szCs w:val="19"/>
+              </w:rPr>
+              <w:t xml:space="preserve">Gás</w:t>
+            </w:r>
+          </w:p>
+        </w:tc>
+        <w:tc>
+          <w:tcPr>
+            <w:tcW w:type="dxa" w:w="950"/>
+            <w:shd w:fill="1F3864" w:val="clear"/>
+            <w:tcMar>
+              <w:top w:type="dxa" w:w="80"/>
+              <w:left w:type="dxa" w:w="110"/>
+              <w:bottom w:type="dxa" w:w="80"/>
+              <w:right w:type="dxa" w:w="110"/>
+            </w:tcMar>
+            <w:vAlign w:val="center"/>
+          </w:tcPr>
+          <w:p>
+            <w:pPr>
+              <w:spacing w:after="0"/>
+            </w:pPr>
+            <w:r>
+              <w:rPr>
+                <w:b/>
+                <w:bCs/>
+                <w:color w:val="FFFFFF"/>
+                <w:sz w:val="19"/>
+                <w:szCs w:val="19"/>
+              </w:rPr>
+              <w:t xml:space="preserve">Mediana</w:t>
+            </w:r>
+          </w:p>
+        </w:tc>
+        <w:tc>
+          <w:tcPr>
+            <w:tcW w:type="dxa" w:w="750"/>
+            <w:shd w:fill="1F3864" w:val="clear"/>
+            <w:tcMar>
+              <w:top w:type="dxa" w:w="80"/>
+              <w:left w:type="dxa" w:w="110"/>
+              <w:bottom w:type="dxa" w:w="80"/>
+              <w:right w:type="dxa" w:w="110"/>
+            </w:tcMar>
+            <w:vAlign w:val="center"/>
+          </w:tcPr>
+          <w:p>
+            <w:pPr>
+              <w:spacing w:after="0"/>
+            </w:pPr>
+            <w:r>
+              <w:rPr>
+                <w:b/>
+                <w:bCs/>
+                <w:color w:val="FFFFFF"/>
+                <w:sz w:val="19"/>
+                <w:szCs w:val="19"/>
+              </w:rPr>
+              <w:t xml:space="preserve">p90</w:t>
+            </w:r>
+          </w:p>
+        </w:tc>
+        <w:tc>
+          <w:tcPr>
+            <w:tcW w:type="dxa" w:w="750"/>
+            <w:shd w:fill="1F3864" w:val="clear"/>
+            <w:tcMar>
+              <w:top w:type="dxa" w:w="80"/>
+              <w:left w:type="dxa" w:w="110"/>
+              <w:bottom w:type="dxa" w:w="80"/>
+              <w:right w:type="dxa" w:w="110"/>
+            </w:tcMar>
+            <w:vAlign w:val="center"/>
+          </w:tcPr>
+          <w:p>
+            <w:pPr>
+              <w:spacing w:after="0"/>
+            </w:pPr>
+            <w:r>
+              <w:rPr>
+                <w:b/>
+                <w:bCs/>
+                <w:color w:val="FFFFFF"/>
+                <w:sz w:val="19"/>
+                <w:szCs w:val="19"/>
+              </w:rPr>
+              <w:t xml:space="preserve">≥ 1,2</w:t>
+            </w:r>
+          </w:p>
+        </w:tc>
+        <w:tc>
+          <w:tcPr>
+            <w:tcW w:type="dxa" w:w="750"/>
+            <w:shd w:fill="1F3864" w:val="clear"/>
+            <w:tcMar>
+              <w:top w:type="dxa" w:w="80"/>
+              <w:left w:type="dxa" w:w="110"/>
+              <w:bottom w:type="dxa" w:w="80"/>
+              <w:right w:type="dxa" w:w="110"/>
+            </w:tcMar>
+            <w:vAlign w:val="center"/>
+          </w:tcPr>
+          <w:p>
+            <w:pPr>
+              <w:spacing w:after="0"/>
+            </w:pPr>
+            <w:r>
+              <w:rPr>
+                <w:b/>
+                <w:bCs/>
+                <w:color w:val="FFFFFF"/>
+                <w:sz w:val="19"/>
+                <w:szCs w:val="19"/>
+              </w:rPr>
+              <w:t xml:space="preserve">≥ 2,0</w:t>
+            </w:r>
+          </w:p>
+        </w:tc>
+      </w:tr>
+      <w:tr>
+        <w:trPr>
+          <w:cantSplit/>
+        </w:trPr>
+        <w:tc>
+          <w:tcPr>
+            <w:tcW w:type="dxa" w:w="1850"/>
+            <w:shd w:fill="FFFFFF" w:val="clear"/>
+            <w:tcMar>
+              <w:top w:type="dxa" w:w="70"/>
+              <w:left w:type="dxa" w:w="110"/>
+              <w:bottom w:type="dxa" w:w="70"/>
+              <w:right w:type="dxa" w:w="110"/>
+            </w:tcMar>
+            <w:vAlign w:val="center"/>
+          </w:tcPr>
+          <w:p>
+            <w:pPr>
+              <w:spacing w:after="0"/>
+            </w:pPr>
+            <w:r>
+              <w:rPr>
+                <w:b w:val="false"/>
+                <w:bCs w:val="false"/>
+                <w:sz w:val="16"/>
+                <w:szCs w:val="16"/>
+              </w:rPr>
+              <w:t xml:space="preserve">14 e 15/4</w:t>
+            </w:r>
+          </w:p>
+        </w:tc>
+        <w:tc>
+          <w:tcPr>
+            <w:tcW w:type="dxa" w:w="1450"/>
+            <w:shd w:fill="FFFFFF" w:val="clear"/>
+            <w:tcMar>
+              <w:top w:type="dxa" w:w="70"/>
+              <w:left w:type="dxa" w:w="110"/>
+              <w:bottom w:type="dxa" w:w="70"/>
+              <w:right w:type="dxa" w:w="110"/>
+            </w:tcMar>
+            <w:vAlign w:val="center"/>
+          </w:tcPr>
+          <w:p>
+            <w:pPr>
+              <w:spacing w:after="0"/>
+            </w:pPr>
+            <w:r>
+              <w:rPr>
+                <w:b w:val="false"/>
+                <w:bCs w:val="false"/>
+                <w:sz w:val="16"/>
+                <w:szCs w:val="16"/>
+              </w:rPr>
+              <w:t xml:space="preserve">43</w:t>
+            </w:r>
+          </w:p>
+        </w:tc>
+        <w:tc>
+          <w:tcPr>
+            <w:tcW w:type="dxa" w:w="950"/>
+            <w:shd w:fill="FFFFFF" w:val="clear"/>
+            <w:tcMar>
+              <w:top w:type="dxa" w:w="70"/>
+              <w:left w:type="dxa" w:w="110"/>
+              <w:bottom w:type="dxa" w:w="70"/>
+              <w:right w:type="dxa" w:w="110"/>
+            </w:tcMar>
+            <w:vAlign w:val="center"/>
+          </w:tcPr>
+          <w:p>
+            <w:pPr>
+              <w:spacing w:after="0"/>
+            </w:pPr>
+            <w:r>
+              <w:rPr>
+                <w:b w:val="false"/>
+                <w:bCs w:val="false"/>
+                <w:sz w:val="16"/>
+                <w:szCs w:val="16"/>
+              </w:rPr>
+              <w:t xml:space="preserve">1,014</w:t>
+            </w:r>
+          </w:p>
+        </w:tc>
+        <w:tc>
+          <w:tcPr>
+            <w:tcW w:type="dxa" w:w="750"/>
+            <w:shd w:fill="FFFFFF" w:val="clear"/>
+            <w:tcMar>
+              <w:top w:type="dxa" w:w="70"/>
+              <w:left w:type="dxa" w:w="110"/>
+              <w:bottom w:type="dxa" w:w="70"/>
+              <w:right w:type="dxa" w:w="110"/>
+            </w:tcMar>
+            <w:vAlign w:val="center"/>
+          </w:tcPr>
+          <w:p>
+            <w:pPr>
+              <w:spacing w:after="0"/>
+            </w:pPr>
+            <w:r>
+              <w:rPr>
+                <w:b w:val="false"/>
+                <w:bCs w:val="false"/>
+                <w:sz w:val="16"/>
+                <w:szCs w:val="16"/>
+              </w:rPr>
+              <w:t xml:space="preserve">1,090</w:t>
+            </w:r>
+          </w:p>
+        </w:tc>
+        <w:tc>
+          <w:tcPr>
+            <w:tcW w:type="dxa" w:w="750"/>
+            <w:shd w:fill="FFFFFF" w:val="clear"/>
+            <w:tcMar>
+              <w:top w:type="dxa" w:w="70"/>
+              <w:left w:type="dxa" w:w="110"/>
+              <w:bottom w:type="dxa" w:w="70"/>
+              <w:right w:type="dxa" w:w="110"/>
+            </w:tcMar>
+            <w:vAlign w:val="center"/>
+          </w:tcPr>
+          <w:p>
+            <w:pPr>
+              <w:spacing w:after="0"/>
+            </w:pPr>
+            <w:r>
+              <w:rPr>
+                <w:b w:val="false"/>
+                <w:bCs w:val="false"/>
+                <w:sz w:val="16"/>
+                <w:szCs w:val="16"/>
+              </w:rPr>
+              <w:t xml:space="preserve">0%</w:t>
+            </w:r>
+          </w:p>
+        </w:tc>
+        <w:tc>
+          <w:tcPr>
+            <w:tcW w:type="dxa" w:w="650"/>
+            <w:shd w:fill="FFFFFF" w:val="clear"/>
+            <w:tcMar>
+              <w:top w:type="dxa" w:w="70"/>
+              <w:left w:type="dxa" w:w="110"/>
+              <w:bottom w:type="dxa" w:w="70"/>
+              <w:right w:type="dxa" w:w="110"/>
+            </w:tcMar>
+            <w:vAlign w:val="center"/>
+          </w:tcPr>
+          <w:p>
+            <w:pPr>
+              <w:spacing w:after="0"/>
+            </w:pPr>
+            <w:r>
+              <w:rPr>
+                <w:b w:val="false"/>
+                <w:bCs w:val="false"/>
+                <w:sz w:val="16"/>
+                <w:szCs w:val="16"/>
+              </w:rPr>
+              <w:t xml:space="preserve">9*</w:t>
+            </w:r>
+          </w:p>
+        </w:tc>
+        <w:tc>
+          <w:tcPr>
+            <w:tcW w:type="dxa" w:w="950"/>
+            <w:shd w:fill="FFFFFF" w:val="clear"/>
+            <w:tcMar>
+              <w:top w:type="dxa" w:w="70"/>
+              <w:left w:type="dxa" w:w="110"/>
+              <w:bottom w:type="dxa" w:w="70"/>
+              <w:right w:type="dxa" w:w="110"/>
+            </w:tcMar>
+            <w:vAlign w:val="center"/>
+          </w:tcPr>
+          <w:p>
+            <w:pPr>
+              <w:spacing w:after="0"/>
+            </w:pPr>
+            <w:r>
+              <w:rPr>
+                <w:b w:val="false"/>
+                <w:bCs w:val="false"/>
+                <w:sz w:val="16"/>
+                <w:szCs w:val="16"/>
+              </w:rPr>
+              <w:t xml:space="preserve">1,101</w:t>
+            </w:r>
+          </w:p>
+        </w:tc>
+        <w:tc>
+          <w:tcPr>
+            <w:tcW w:type="dxa" w:w="750"/>
+            <w:shd w:fill="FFFFFF" w:val="clear"/>
+            <w:tcMar>
+              <w:top w:type="dxa" w:w="70"/>
+              <w:left w:type="dxa" w:w="110"/>
+              <w:bottom w:type="dxa" w:w="70"/>
+              <w:right w:type="dxa" w:w="110"/>
+            </w:tcMar>
+            <w:vAlign w:val="center"/>
+          </w:tcPr>
+          <w:p>
+            <w:pPr>
+              <w:spacing w:after="0"/>
+            </w:pPr>
+            <w:r>
+              <w:rPr>
+                <w:b w:val="false"/>
+                <w:bCs w:val="false"/>
+                <w:sz w:val="16"/>
+                <w:szCs w:val="16"/>
+              </w:rPr>
+              <w:t xml:space="preserve">1,177</w:t>
+            </w:r>
+          </w:p>
+        </w:tc>
+        <w:tc>
+          <w:tcPr>
+            <w:tcW w:type="dxa" w:w="750"/>
+            <w:shd w:fill="FFFFFF" w:val="clear"/>
+            <w:tcMar>
+              <w:top w:type="dxa" w:w="70"/>
+              <w:left w:type="dxa" w:w="110"/>
+              <w:bottom w:type="dxa" w:w="70"/>
+              <w:right w:type="dxa" w:w="110"/>
+            </w:tcMar>
+            <w:vAlign w:val="center"/>
+          </w:tcPr>
+          <w:p>
+            <w:pPr>
+              <w:spacing w:after="0"/>
+            </w:pPr>
+            <w:r>
+              <w:rPr>
+                <w:b w:val="false"/>
+                <w:bCs w:val="false"/>
+                <w:sz w:val="16"/>
+                <w:szCs w:val="16"/>
+              </w:rPr>
+              <w:t xml:space="preserve">11,1%</w:t>
+            </w:r>
+          </w:p>
+        </w:tc>
+        <w:tc>
+          <w:tcPr>
+            <w:tcW w:type="dxa" w:w="750"/>
+            <w:shd w:fill="FFFFFF" w:val="clear"/>
+            <w:tcMar>
+              <w:top w:type="dxa" w:w="70"/>
+              <w:left w:type="dxa" w:w="110"/>
+              <w:bottom w:type="dxa" w:w="70"/>
+              <w:right w:type="dxa" w:w="110"/>
+            </w:tcMar>
+            <w:vAlign w:val="center"/>
+          </w:tcPr>
+          <w:p>
+            <w:pPr>
+              <w:spacing w:after="0"/>
+            </w:pPr>
+            <w:r>
+              <w:rPr>
+                <w:b w:val="false"/>
+                <w:bCs w:val="false"/>
+                <w:sz w:val="16"/>
+                <w:szCs w:val="16"/>
+              </w:rPr>
+              <w:t xml:space="preserve">0%</w:t>
+            </w:r>
+          </w:p>
+        </w:tc>
+      </w:tr>
+      <w:tr>
+        <w:trPr>
+          <w:cantSplit/>
+        </w:trPr>
+        <w:tc>
+          <w:tcPr>
+            <w:tcW w:type="dxa" w:w="1850"/>
+            <w:shd w:fill="F2F2F2" w:val="clear"/>
+            <w:tcMar>
+              <w:top w:type="dxa" w:w="70"/>
+              <w:left w:type="dxa" w:w="110"/>
+              <w:bottom w:type="dxa" w:w="70"/>
+              <w:right w:type="dxa" w:w="110"/>
+            </w:tcMar>
+            <w:vAlign w:val="center"/>
+          </w:tcPr>
+          <w:p>
+            <w:pPr>
+              <w:spacing w:after="0"/>
+            </w:pPr>
+            <w:r>
+              <w:rPr>
+                <w:b w:val="false"/>
+                <w:bCs w:val="false"/>
+                <w:sz w:val="16"/>
+                <w:szCs w:val="16"/>
+              </w:rPr>
+              <w:t xml:space="preserve">19 e 20/5</w:t>
+            </w:r>
+          </w:p>
+        </w:tc>
+        <w:tc>
+          <w:tcPr>
+            <w:tcW w:type="dxa" w:w="1450"/>
+            <w:shd w:fill="F2F2F2" w:val="clear"/>
+            <w:tcMar>
+              <w:top w:type="dxa" w:w="70"/>
+              <w:left w:type="dxa" w:w="110"/>
+              <w:bottom w:type="dxa" w:w="70"/>
+              <w:right w:type="dxa" w:w="110"/>
+            </w:tcMar>
+            <w:vAlign w:val="center"/>
+          </w:tcPr>
+          <w:p>
+            <w:pPr>
+              <w:spacing w:after="0"/>
+            </w:pPr>
+            <w:r>
+              <w:rPr>
+                <w:b w:val="false"/>
+                <w:bCs w:val="false"/>
+                <w:sz w:val="16"/>
+                <w:szCs w:val="16"/>
+              </w:rPr>
+              <w:t xml:space="preserve">43</w:t>
+            </w:r>
+          </w:p>
+        </w:tc>
+        <w:tc>
+          <w:tcPr>
+            <w:tcW w:type="dxa" w:w="950"/>
+            <w:shd w:fill="F2F2F2" w:val="clear"/>
+            <w:tcMar>
+              <w:top w:type="dxa" w:w="70"/>
+              <w:left w:type="dxa" w:w="110"/>
+              <w:bottom w:type="dxa" w:w="70"/>
+              <w:right w:type="dxa" w:w="110"/>
+            </w:tcMar>
+            <w:vAlign w:val="center"/>
+          </w:tcPr>
+          <w:p>
+            <w:pPr>
+              <w:spacing w:after="0"/>
+            </w:pPr>
+            <w:r>
+              <w:rPr>
+                <w:b w:val="false"/>
+                <w:bCs w:val="false"/>
+                <w:sz w:val="16"/>
+                <w:szCs w:val="16"/>
+              </w:rPr>
+              <w:t xml:space="preserve">1,045</w:t>
+            </w:r>
+          </w:p>
+        </w:tc>
+        <w:tc>
+          <w:tcPr>
+            <w:tcW w:type="dxa" w:w="750"/>
+            <w:shd w:fill="F2F2F2" w:val="clear"/>
+            <w:tcMar>
+              <w:top w:type="dxa" w:w="70"/>
+              <w:left w:type="dxa" w:w="110"/>
+              <w:bottom w:type="dxa" w:w="70"/>
+              <w:right w:type="dxa" w:w="110"/>
+            </w:tcMar>
+            <w:vAlign w:val="center"/>
+          </w:tcPr>
+          <w:p>
+            <w:pPr>
+              <w:spacing w:after="0"/>
+            </w:pPr>
+            <w:r>
+              <w:rPr>
+                <w:b w:val="false"/>
+                <w:bCs w:val="false"/>
+                <w:sz w:val="16"/>
+                <w:szCs w:val="16"/>
+              </w:rPr>
+              <w:t xml:space="preserve">1,123</w:t>
+            </w:r>
+          </w:p>
+        </w:tc>
+        <w:tc>
+          <w:tcPr>
+            <w:tcW w:type="dxa" w:w="750"/>
+            <w:shd w:fill="F2F2F2" w:val="clear"/>
+            <w:tcMar>
+              <w:top w:type="dxa" w:w="70"/>
+              <w:left w:type="dxa" w:w="110"/>
+              <w:bottom w:type="dxa" w:w="70"/>
+              <w:right w:type="dxa" w:w="110"/>
+            </w:tcMar>
+            <w:vAlign w:val="center"/>
+          </w:tcPr>
+          <w:p>
+            <w:pPr>
+              <w:spacing w:after="0"/>
+            </w:pPr>
+            <w:r>
+              <w:rPr>
+                <w:b w:val="false"/>
+                <w:bCs w:val="false"/>
+                <w:sz w:val="16"/>
+                <w:szCs w:val="16"/>
+              </w:rPr>
+              <w:t xml:space="preserve">0%</w:t>
+            </w:r>
+          </w:p>
+        </w:tc>
+        <w:tc>
+          <w:tcPr>
+            <w:tcW w:type="dxa" w:w="650"/>
+            <w:shd w:fill="F2F2F2" w:val="clear"/>
+            <w:tcMar>
+              <w:top w:type="dxa" w:w="70"/>
+              <w:left w:type="dxa" w:w="110"/>
+              <w:bottom w:type="dxa" w:w="70"/>
+              <w:right w:type="dxa" w:w="110"/>
+            </w:tcMar>
+            <w:vAlign w:val="center"/>
+          </w:tcPr>
+          <w:p>
+            <w:pPr>
+              <w:spacing w:after="0"/>
+            </w:pPr>
+            <w:r>
+              <w:rPr>
+                <w:b w:val="false"/>
+                <w:bCs w:val="false"/>
+                <w:sz w:val="16"/>
+                <w:szCs w:val="16"/>
+              </w:rPr>
+              <w:t xml:space="preserve">7*</w:t>
+            </w:r>
+          </w:p>
+        </w:tc>
+        <w:tc>
+          <w:tcPr>
+            <w:tcW w:type="dxa" w:w="950"/>
+            <w:shd w:fill="F2F2F2" w:val="clear"/>
+            <w:tcMar>
+              <w:top w:type="dxa" w:w="70"/>
+              <w:left w:type="dxa" w:w="110"/>
+              <w:bottom w:type="dxa" w:w="70"/>
+              <w:right w:type="dxa" w:w="110"/>
+            </w:tcMar>
+            <w:vAlign w:val="center"/>
+          </w:tcPr>
+          <w:p>
+            <w:pPr>
+              <w:spacing w:after="0"/>
+            </w:pPr>
+            <w:r>
+              <w:rPr>
+                <w:b w:val="false"/>
+                <w:bCs w:val="false"/>
+                <w:sz w:val="16"/>
+                <w:szCs w:val="16"/>
+              </w:rPr>
+              <w:t xml:space="preserve">1,091</w:t>
+            </w:r>
+          </w:p>
+        </w:tc>
+        <w:tc>
+          <w:tcPr>
+            <w:tcW w:type="dxa" w:w="750"/>
+            <w:shd w:fill="F2F2F2" w:val="clear"/>
+            <w:tcMar>
+              <w:top w:type="dxa" w:w="70"/>
+              <w:left w:type="dxa" w:w="110"/>
+              <w:bottom w:type="dxa" w:w="70"/>
+              <w:right w:type="dxa" w:w="110"/>
+            </w:tcMar>
+            <w:vAlign w:val="center"/>
+          </w:tcPr>
+          <w:p>
+            <w:pPr>
+              <w:spacing w:after="0"/>
+            </w:pPr>
+            <w:r>
+              <w:rPr>
+                <w:b w:val="false"/>
+                <w:bCs w:val="false"/>
+                <w:sz w:val="16"/>
+                <w:szCs w:val="16"/>
+              </w:rPr>
+              <w:t xml:space="preserve">1,189</w:t>
+            </w:r>
+          </w:p>
+        </w:tc>
+        <w:tc>
+          <w:tcPr>
+            <w:tcW w:type="dxa" w:w="750"/>
+            <w:shd w:fill="F2F2F2" w:val="clear"/>
+            <w:tcMar>
+              <w:top w:type="dxa" w:w="70"/>
+              <w:left w:type="dxa" w:w="110"/>
+              <w:bottom w:type="dxa" w:w="70"/>
+              <w:right w:type="dxa" w:w="110"/>
+            </w:tcMar>
+            <w:vAlign w:val="center"/>
+          </w:tcPr>
+          <w:p>
+            <w:pPr>
+              <w:spacing w:after="0"/>
+            </w:pPr>
+            <w:r>
+              <w:rPr>
+                <w:b w:val="false"/>
+                <w:bCs w:val="false"/>
+                <w:sz w:val="16"/>
+                <w:szCs w:val="16"/>
+              </w:rPr>
+              <w:t xml:space="preserve">14,3%</w:t>
+            </w:r>
+          </w:p>
+        </w:tc>
+        <w:tc>
+          <w:tcPr>
+            <w:tcW w:type="dxa" w:w="750"/>
+            <w:shd w:fill="F2F2F2" w:val="clear"/>
+            <w:tcMar>
+              <w:top w:type="dxa" w:w="70"/>
+              <w:left w:type="dxa" w:w="110"/>
+              <w:bottom w:type="dxa" w:w="70"/>
+              <w:right w:type="dxa" w:w="110"/>
+            </w:tcMar>
+            <w:vAlign w:val="center"/>
+          </w:tcPr>
+          <w:p>
+            <w:pPr>
+              <w:spacing w:after="0"/>
+            </w:pPr>
+            <w:r>
+              <w:rPr>
+                <w:b w:val="false"/>
+                <w:bCs w:val="false"/>
+                <w:sz w:val="16"/>
+                <w:szCs w:val="16"/>
+              </w:rPr>
+              <w:t xml:space="preserve">0%</w:t>
+            </w:r>
+          </w:p>
+        </w:tc>
+      </w:tr>
+      <w:tr>
+        <w:trPr>
+          <w:cantSplit/>
+        </w:trPr>
+        <w:tc>
+          <w:tcPr>
+            <w:tcW w:type="dxa" w:w="1850"/>
+            <w:shd w:fill="FFFFFF" w:val="clear"/>
+            <w:tcMar>
+              <w:top w:type="dxa" w:w="70"/>
+              <w:left w:type="dxa" w:w="110"/>
+              <w:bottom w:type="dxa" w:w="70"/>
+              <w:right w:type="dxa" w:w="110"/>
+            </w:tcMar>
+            <w:vAlign w:val="center"/>
+          </w:tcPr>
+          <w:p>
+            <w:pPr>
+              <w:spacing w:after="0"/>
+            </w:pPr>
+            <w:r>
+              <w:rPr>
+                <w:b w:val="false"/>
+                <w:bCs w:val="false"/>
+                <w:sz w:val="16"/>
+                <w:szCs w:val="16"/>
+              </w:rPr>
+              <w:t xml:space="preserve">16 e 17/6</w:t>
+            </w:r>
+          </w:p>
+        </w:tc>
+        <w:tc>
+          <w:tcPr>
+            <w:tcW w:type="dxa" w:w="1450"/>
+            <w:shd w:fill="FFFFFF" w:val="clear"/>
+            <w:tcMar>
+              <w:top w:type="dxa" w:w="70"/>
+              <w:left w:type="dxa" w:w="110"/>
+              <w:bottom w:type="dxa" w:w="70"/>
+              <w:right w:type="dxa" w:w="110"/>
+            </w:tcMar>
+            <w:vAlign w:val="center"/>
+          </w:tcPr>
+          <w:p>
+            <w:pPr>
+              <w:spacing w:after="0"/>
+            </w:pPr>
+            <w:r>
+              <w:rPr>
+                <w:b w:val="false"/>
+                <w:bCs w:val="false"/>
+                <w:sz w:val="16"/>
+                <w:szCs w:val="16"/>
+              </w:rPr>
+              <w:t xml:space="preserve">26</w:t>
+            </w:r>
+          </w:p>
+        </w:tc>
+        <w:tc>
+          <w:tcPr>
+            <w:tcW w:type="dxa" w:w="950"/>
+            <w:shd w:fill="FFFFFF" w:val="clear"/>
+            <w:tcMar>
+              <w:top w:type="dxa" w:w="70"/>
+              <w:left w:type="dxa" w:w="110"/>
+              <w:bottom w:type="dxa" w:w="70"/>
+              <w:right w:type="dxa" w:w="110"/>
+            </w:tcMar>
+            <w:vAlign w:val="center"/>
+          </w:tcPr>
+          <w:p>
+            <w:pPr>
+              <w:spacing w:after="0"/>
+            </w:pPr>
+            <w:r>
+              <w:rPr>
+                <w:b w:val="false"/>
+                <w:bCs w:val="false"/>
+                <w:sz w:val="16"/>
+                <w:szCs w:val="16"/>
+              </w:rPr>
+              <w:t xml:space="preserve">1,026</w:t>
+            </w:r>
+          </w:p>
+        </w:tc>
+        <w:tc>
+          <w:tcPr>
+            <w:tcW w:type="dxa" w:w="750"/>
+            <w:shd w:fill="FFFFFF" w:val="clear"/>
+            <w:tcMar>
+              <w:top w:type="dxa" w:w="70"/>
+              <w:left w:type="dxa" w:w="110"/>
+              <w:bottom w:type="dxa" w:w="70"/>
+              <w:right w:type="dxa" w:w="110"/>
+            </w:tcMar>
+            <w:vAlign w:val="center"/>
+          </w:tcPr>
+          <w:p>
+            <w:pPr>
+              <w:spacing w:after="0"/>
+            </w:pPr>
+            <w:r>
+              <w:rPr>
+                <w:b w:val="false"/>
+                <w:bCs w:val="false"/>
+                <w:sz w:val="16"/>
+                <w:szCs w:val="16"/>
+              </w:rPr>
+              <w:t xml:space="preserve">1,134</w:t>
+            </w:r>
+          </w:p>
+        </w:tc>
+        <w:tc>
+          <w:tcPr>
+            <w:tcW w:type="dxa" w:w="750"/>
+            <w:shd w:fill="FFFFFF" w:val="clear"/>
+            <w:tcMar>
+              <w:top w:type="dxa" w:w="70"/>
+              <w:left w:type="dxa" w:w="110"/>
+              <w:bottom w:type="dxa" w:w="70"/>
+              <w:right w:type="dxa" w:w="110"/>
+            </w:tcMar>
+            <w:vAlign w:val="center"/>
+          </w:tcPr>
+          <w:p>
+            <w:pPr>
+              <w:spacing w:after="0"/>
+            </w:pPr>
+            <w:r>
+              <w:rPr>
+                <w:b w:val="false"/>
+                <w:bCs w:val="false"/>
+                <w:sz w:val="16"/>
+                <w:szCs w:val="16"/>
+              </w:rPr>
+              <w:t xml:space="preserve">3,8%</w:t>
+            </w:r>
+          </w:p>
+        </w:tc>
+        <w:tc>
+          <w:tcPr>
+            <w:tcW w:type="dxa" w:w="650"/>
+            <w:shd w:fill="FFFFFF" w:val="clear"/>
+            <w:tcMar>
+              <w:top w:type="dxa" w:w="70"/>
+              <w:left w:type="dxa" w:w="110"/>
+              <w:bottom w:type="dxa" w:w="70"/>
+              <w:right w:type="dxa" w:w="110"/>
+            </w:tcMar>
+            <w:vAlign w:val="center"/>
+          </w:tcPr>
+          <w:p>
+            <w:pPr>
+              <w:spacing w:after="0"/>
+            </w:pPr>
+            <w:r>
+              <w:rPr>
+                <w:b w:val="false"/>
+                <w:bCs w:val="false"/>
+                <w:sz w:val="16"/>
+                <w:szCs w:val="16"/>
+              </w:rPr>
+              <w:t xml:space="preserve">—</w:t>
+            </w:r>
+          </w:p>
+        </w:tc>
+        <w:tc>
+          <w:tcPr>
+            <w:tcW w:type="dxa" w:w="950"/>
+            <w:shd w:fill="FFFFFF" w:val="clear"/>
+            <w:tcMar>
+              <w:top w:type="dxa" w:w="70"/>
+              <w:left w:type="dxa" w:w="110"/>
+              <w:bottom w:type="dxa" w:w="70"/>
+              <w:right w:type="dxa" w:w="110"/>
+            </w:tcMar>
+            <w:vAlign w:val="center"/>
+          </w:tcPr>
+          <w:p>
+            <w:pPr>
+              <w:spacing w:after="0"/>
+            </w:pPr>
+            <w:r>
+              <w:rPr>
+                <w:b w:val="false"/>
+                <w:bCs w:val="false"/>
+                <w:sz w:val="16"/>
+                <w:szCs w:val="16"/>
+              </w:rPr>
+              <w:t xml:space="preserve">—</w:t>
+            </w:r>
+          </w:p>
+        </w:tc>
+        <w:tc>
+          <w:tcPr>
+            <w:tcW w:type="dxa" w:w="750"/>
+            <w:shd w:fill="FFFFFF" w:val="clear"/>
+            <w:tcMar>
+              <w:top w:type="dxa" w:w="70"/>
+              <w:left w:type="dxa" w:w="110"/>
+              <w:bottom w:type="dxa" w:w="70"/>
+              <w:right w:type="dxa" w:w="110"/>
+            </w:tcMar>
+            <w:vAlign w:val="center"/>
+          </w:tcPr>
+          <w:p>
+            <w:pPr>
+              <w:spacing w:after="0"/>
+            </w:pPr>
+            <w:r>
+              <w:rPr>
+                <w:b w:val="false"/>
+                <w:bCs w:val="false"/>
+                <w:sz w:val="16"/>
+                <w:szCs w:val="16"/>
+              </w:rPr>
+              <w:t xml:space="preserve">—</w:t>
+            </w:r>
+          </w:p>
+        </w:tc>
+        <w:tc>
+          <w:tcPr>
+            <w:tcW w:type="dxa" w:w="750"/>
+            <w:shd w:fill="FFFFFF" w:val="clear"/>
+            <w:tcMar>
+              <w:top w:type="dxa" w:w="70"/>
+              <w:left w:type="dxa" w:w="110"/>
+              <w:bottom w:type="dxa" w:w="70"/>
+              <w:right w:type="dxa" w:w="110"/>
+            </w:tcMar>
+            <w:vAlign w:val="center"/>
+          </w:tcPr>
+          <w:p>
+            <w:pPr>
+              <w:spacing w:after="0"/>
+            </w:pPr>
+            <w:r>
+              <w:rPr>
+                <w:b w:val="false"/>
+                <w:bCs w:val="false"/>
+                <w:sz w:val="16"/>
+                <w:szCs w:val="16"/>
+              </w:rPr>
+              <w:t xml:space="preserve">—</w:t>
+            </w:r>
+          </w:p>
+        </w:tc>
+        <w:tc>
+          <w:tcPr>
+            <w:tcW w:type="dxa" w:w="750"/>
+            <w:shd w:fill="FFFFFF" w:val="clear"/>
+            <w:tcMar>
+              <w:top w:type="dxa" w:w="70"/>
+              <w:left w:type="dxa" w:w="110"/>
+              <w:bottom w:type="dxa" w:w="70"/>
+              <w:right w:type="dxa" w:w="110"/>
+            </w:tcMar>
+            <w:vAlign w:val="center"/>
+          </w:tcPr>
+          <w:p>
+            <w:pPr>
+              <w:spacing w:after="0"/>
+            </w:pPr>
+            <w:r>
+              <w:rPr>
+                <w:b w:val="false"/>
+                <w:bCs w:val="false"/>
+                <w:sz w:val="16"/>
+                <w:szCs w:val="16"/>
+              </w:rPr>
+              <w:t xml:space="preserve">—</w:t>
+            </w:r>
+          </w:p>
+        </w:tc>
+      </w:tr>
+      <w:tr>
+        <w:trPr>
+          <w:cantSplit/>
+        </w:trPr>
+        <w:tc>
+          <w:tcPr>
+            <w:tcW w:type="dxa" w:w="1850"/>
+            <w:shd w:fill="F2F2F2" w:val="clear"/>
+            <w:tcMar>
+              <w:top w:type="dxa" w:w="70"/>
+              <w:left w:type="dxa" w:w="110"/>
+              <w:bottom w:type="dxa" w:w="70"/>
+              <w:right w:type="dxa" w:w="110"/>
+            </w:tcMar>
+            <w:vAlign w:val="center"/>
+          </w:tcPr>
+          <w:p>
+            <w:pPr>
+              <w:spacing w:after="0"/>
+            </w:pPr>
+            <w:r>
+              <w:rPr>
+                <w:b w:val="false"/>
+                <w:bCs w:val="false"/>
+                <w:sz w:val="16"/>
+                <w:szCs w:val="16"/>
+              </w:rPr>
+              <w:t xml:space="preserve">7 janelas, janeiro a junho</w:t>
+            </w:r>
+          </w:p>
+        </w:tc>
+        <w:tc>
+          <w:tcPr>
+            <w:tcW w:type="dxa" w:w="1450"/>
+            <w:shd w:fill="F2F2F2" w:val="clear"/>
+            <w:tcMar>
+              <w:top w:type="dxa" w:w="70"/>
+              <w:left w:type="dxa" w:w="110"/>
+              <w:bottom w:type="dxa" w:w="70"/>
+              <w:right w:type="dxa" w:w="110"/>
+            </w:tcMar>
+            <w:vAlign w:val="center"/>
+          </w:tcPr>
+          <w:p>
+            <w:pPr>
+              <w:spacing w:after="0"/>
+            </w:pPr>
+            <w:r>
+              <w:rPr>
+                <w:b w:val="false"/>
+                <w:bCs w:val="false"/>
+                <w:sz w:val="16"/>
+                <w:szCs w:val="16"/>
+              </w:rPr>
+              <w:t xml:space="preserve">324</w:t>
+            </w:r>
+          </w:p>
+        </w:tc>
+        <w:tc>
+          <w:tcPr>
+            <w:tcW w:type="dxa" w:w="950"/>
+            <w:shd w:fill="F2F2F2" w:val="clear"/>
+            <w:tcMar>
+              <w:top w:type="dxa" w:w="70"/>
+              <w:left w:type="dxa" w:w="110"/>
+              <w:bottom w:type="dxa" w:w="70"/>
+              <w:right w:type="dxa" w:w="110"/>
+            </w:tcMar>
+            <w:vAlign w:val="center"/>
+          </w:tcPr>
+          <w:p>
+            <w:pPr>
+              <w:spacing w:after="0"/>
+            </w:pPr>
+            <w:r>
+              <w:rPr>
+                <w:b w:val="false"/>
+                <w:bCs w:val="false"/>
+                <w:sz w:val="16"/>
+                <w:szCs w:val="16"/>
+              </w:rPr>
+              <w:t xml:space="preserve">0,989</w:t>
+            </w:r>
+          </w:p>
+        </w:tc>
+        <w:tc>
+          <w:tcPr>
+            <w:tcW w:type="dxa" w:w="750"/>
+            <w:shd w:fill="F2F2F2" w:val="clear"/>
+            <w:tcMar>
+              <w:top w:type="dxa" w:w="70"/>
+              <w:left w:type="dxa" w:w="110"/>
+              <w:bottom w:type="dxa" w:w="70"/>
+              <w:right w:type="dxa" w:w="110"/>
+            </w:tcMar>
+            <w:vAlign w:val="center"/>
+          </w:tcPr>
+          <w:p>
+            <w:pPr>
+              <w:spacing w:after="0"/>
+            </w:pPr>
+            <w:r>
+              <w:rPr>
+                <w:b w:val="false"/>
+                <w:bCs w:val="false"/>
+                <w:sz w:val="16"/>
+                <w:szCs w:val="16"/>
+              </w:rPr>
+              <w:t xml:space="preserve">1,111</w:t>
+            </w:r>
+          </w:p>
+        </w:tc>
+        <w:tc>
+          <w:tcPr>
+            <w:tcW w:type="dxa" w:w="750"/>
+            <w:shd w:fill="F2F2F2" w:val="clear"/>
+            <w:tcMar>
+              <w:top w:type="dxa" w:w="70"/>
+              <w:left w:type="dxa" w:w="110"/>
+              <w:bottom w:type="dxa" w:w="70"/>
+              <w:right w:type="dxa" w:w="110"/>
+            </w:tcMar>
+            <w:vAlign w:val="center"/>
+          </w:tcPr>
+          <w:p>
+            <w:pPr>
+              <w:spacing w:after="0"/>
+            </w:pPr>
+            <w:r>
+              <w:rPr>
+                <w:b w:val="false"/>
+                <w:bCs w:val="false"/>
+                <w:sz w:val="16"/>
+                <w:szCs w:val="16"/>
+              </w:rPr>
+              <w:t xml:space="preserve">3,1%</w:t>
+            </w:r>
+          </w:p>
+        </w:tc>
+        <w:tc>
+          <w:tcPr>
+            <w:tcW w:type="dxa" w:w="650"/>
+            <w:shd w:fill="F2F2F2" w:val="clear"/>
+            <w:tcMar>
+              <w:top w:type="dxa" w:w="70"/>
+              <w:left w:type="dxa" w:w="110"/>
+              <w:bottom w:type="dxa" w:w="70"/>
+              <w:right w:type="dxa" w:w="110"/>
+            </w:tcMar>
+            <w:vAlign w:val="center"/>
+          </w:tcPr>
+          <w:p>
+            <w:pPr>
+              <w:spacing w:after="0"/>
+            </w:pPr>
+            <w:r>
+              <w:rPr>
+                <w:b w:val="false"/>
+                <w:bCs w:val="false"/>
+                <w:sz w:val="16"/>
+                <w:szCs w:val="16"/>
+              </w:rPr>
+              <w:t xml:space="preserve">86</w:t>
+            </w:r>
+          </w:p>
+        </w:tc>
+        <w:tc>
+          <w:tcPr>
+            <w:tcW w:type="dxa" w:w="950"/>
+            <w:shd w:fill="F2F2F2" w:val="clear"/>
+            <w:tcMar>
+              <w:top w:type="dxa" w:w="70"/>
+              <w:left w:type="dxa" w:w="110"/>
+              <w:bottom w:type="dxa" w:w="70"/>
+              <w:right w:type="dxa" w:w="110"/>
+            </w:tcMar>
+            <w:vAlign w:val="center"/>
+          </w:tcPr>
+          <w:p>
+            <w:pPr>
+              <w:spacing w:after="0"/>
+            </w:pPr>
+            <w:r>
+              <w:rPr>
+                <w:b w:val="false"/>
+                <w:bCs w:val="false"/>
+                <w:sz w:val="16"/>
+                <w:szCs w:val="16"/>
+              </w:rPr>
+              <w:t xml:space="preserve">1,053</w:t>
+            </w:r>
+          </w:p>
+        </w:tc>
+        <w:tc>
+          <w:tcPr>
+            <w:tcW w:type="dxa" w:w="750"/>
+            <w:shd w:fill="F2F2F2" w:val="clear"/>
+            <w:tcMar>
+              <w:top w:type="dxa" w:w="70"/>
+              <w:left w:type="dxa" w:w="110"/>
+              <w:bottom w:type="dxa" w:w="70"/>
+              <w:right w:type="dxa" w:w="110"/>
+            </w:tcMar>
+            <w:vAlign w:val="center"/>
+          </w:tcPr>
+          <w:p>
+            <w:pPr>
+              <w:spacing w:after="0"/>
+            </w:pPr>
+            <w:r>
+              <w:rPr>
+                <w:b w:val="false"/>
+                <w:bCs w:val="false"/>
+                <w:sz w:val="16"/>
+                <w:szCs w:val="16"/>
+              </w:rPr>
+              <w:t xml:space="preserve">1,300</w:t>
+            </w:r>
+          </w:p>
+        </w:tc>
+        <w:tc>
+          <w:tcPr>
+            <w:tcW w:type="dxa" w:w="750"/>
+            <w:shd w:fill="F2F2F2" w:val="clear"/>
+            <w:tcMar>
+              <w:top w:type="dxa" w:w="70"/>
+              <w:left w:type="dxa" w:w="110"/>
+              <w:bottom w:type="dxa" w:w="70"/>
+              <w:right w:type="dxa" w:w="110"/>
+            </w:tcMar>
+            <w:vAlign w:val="center"/>
+          </w:tcPr>
+          <w:p>
+            <w:pPr>
+              <w:spacing w:after="0"/>
+            </w:pPr>
+            <w:r>
+              <w:rPr>
+                <w:b w:val="false"/>
+                <w:bCs w:val="false"/>
+                <w:sz w:val="16"/>
+                <w:szCs w:val="16"/>
+              </w:rPr>
+              <w:t xml:space="preserve">16,3%</w:t>
+            </w:r>
+          </w:p>
+        </w:tc>
+        <w:tc>
+          <w:tcPr>
+            <w:tcW w:type="dxa" w:w="750"/>
+            <w:shd w:fill="F2F2F2" w:val="clear"/>
+            <w:tcMar>
+              <w:top w:type="dxa" w:w="70"/>
+              <w:left w:type="dxa" w:w="110"/>
+              <w:bottom w:type="dxa" w:w="70"/>
+              <w:right w:type="dxa" w:w="110"/>
+            </w:tcMar>
+            <w:vAlign w:val="center"/>
+          </w:tcPr>
+          <w:p>
+            <w:pPr>
+              <w:spacing w:after="0"/>
+            </w:pPr>
+            <w:r>
+              <w:rPr>
+                <w:b w:val="false"/>
+                <w:bCs w:val="false"/>
+                <w:sz w:val="16"/>
+                <w:szCs w:val="16"/>
+              </w:rPr>
+              <w:t xml:space="preserve">4,7%</w:t>
+            </w:r>
+          </w:p>
+        </w:tc>
+      </w:tr>
+    </w:tbl>
+    <w:p>
+      <w:pPr>
+        <w:spacing w:after="80"/>
+      </w:pPr>
+    </w:p>
+    <w:tbl>
+      <w:tblPr>
+        <w:tblW w:type="dxa" w:w="9600"/>
+        <w:tblBorders>
+          <w:top w:val="single" w:color="BF8F00" w:sz="6"/>
+          <w:left w:val="single" w:color="BF8F00" w:sz="18"/>
+          <w:bottom w:val="single" w:color="BF8F00" w:sz="6"/>
+          <w:right w:val="single" w:color="BF8F00" w:sz="6"/>
+          <w:insideH w:val="none" w:color="FFFFFF" w:sz="0"/>
+          <w:insideV w:val="none" w:color="FFFFFF" w:sz="0"/>
+        </w:tblBorders>
+      </w:tblPr>
+      <w:tblGrid>
+        <w:gridCol w:w="9600"/>
+      </w:tblGrid>
+      <w:tr>
+        <w:trPr>
+          <w:cantSplit/>
+        </w:trPr>
+        <w:tc>
+          <w:tcPr>
+            <w:tcW w:type="dxa" w:w="9600"/>
+            <w:shd w:fill="FFF6E0" w:val="clear"/>
+            <w:tcMar>
+              <w:top w:type="dxa" w:w="130"/>
+              <w:left w:type="dxa" w:w="170"/>
+              <w:bottom w:type="dxa" w:w="130"/>
+              <w:right w:type="dxa" w:w="150"/>
+            </w:tcMar>
+          </w:tcPr>
+          <w:p>
+            <w:pPr>
+              <w:spacing w:after="90"/>
+            </w:pPr>
+            <w:r>
+              <w:rPr>
+                <w:b/>
+                <w:bCs/>
+                <w:color w:val="000000"/>
+              </w:rPr>
+              <w:t xml:space="preserve">Observação, não calibração</w:t>
+            </w:r>
+          </w:p>
+          <w:p>
+            <w:pPr>
+              <w:spacing w:after="70"/>
+            </w:pPr>
+            <w:r>
+              <w:t xml:space="preserve">No combustível, o homologado fica perto da mediana da UF e o limiar de 1,20 separa uma cauda de cerca de 3%. No gás de cozinha, a cauda é longa e os maiores casos sugerem outro produto, não outro preço: R$ 785,00 "o botijão" (provável cilindro de 45 kg, marcado para conferir unidade) e R$ 260,00 a R$ 335,00 (perto do botijão completo, com o vasilhame). O reconhecimento do gás precisa ser conferido nesses itens antes de qualquer limiar. Os limiares da tabela de parâmetros continuam os iniciais (ADR-027).</w:t>
             </w:r>
           </w:p>
         </w:tc>

</xml_diff>